<commit_message>
Add PRISMA 2020 flow diagram to the Al-Bayan SLR .docx (Research Method, Figure 1)
</commit_message>
<xml_diff>
--- a/Islamic_Economic_Literacy_Education_Gen_Z_SLR_AlBayan.docx
+++ b/Islamic_Economic_Literacy_Education_Gen_Z_SLR_AlBayan.docx
@@ -914,7 +914,62 @@
           <w:i w:val="0"/>
           <w:sz w:val="24"/>
         </w:rPr>
-        <w:t>Selection proceeded in five PRISMA-based stages: identification, de-duplication, title/abstract screening, full-text eligibility assessment, and final inclusion. Each candidate study was appraised with a seven-item quality-assessment checklist scored Yes = 1, Partially = 0.5, No = 0 (maximum = 7), covering clarity of aim, relevance to Islamic/Sharia financial literacy, focus on Generation Z/Muslim youth, clarity of method, evidential support of findings, implications for Islamic economics/education/behaviour, and acknowledgement of limitations. Studies scoring ≥ 4.0 of 7 (≈ 57%) were retained.</w:t>
+        <w:t>Selection proceeded in five PRISMA-based stages: identification, de-duplication, title/abstract screening, full-text eligibility assessment, and final inclusion. Each candidate study was appraised with a seven-item quality-assessment checklist scored Yes = 1, Partially = 0.5, No = 0 (maximum = 7), covering clarity of aim, relevance to Islamic/Sharia financial literacy, focus on Generation Z/Muslim youth, clarity of method, evidential support of findings, implications for Islamic economics/education/behaviour, and acknowledgement of limitations. Studies scoring ≥ 4.0 of 7 (≈ 57%) were retained. The selection process is summarised in the PRISMA 2020 flow diagram (Figure 1).</w:t>
+      </w:r>
+    </w:p>
+    <w:p>
+      <w:pPr>
+        <w:spacing w:line="240" w:lineRule="auto" w:after="40" w:before="80"/>
+        <w:jc w:val="center"/>
+      </w:pPr>
+      <w:r>
+        <w:drawing>
+          <wp:inline xmlns:a="http://schemas.openxmlformats.org/drawingml/2006/main" xmlns:pic="http://schemas.openxmlformats.org/drawingml/2006/picture">
+            <wp:extent cx="4860000" cy="5434962"/>
+            <wp:docPr id="1" name="Picture 1"/>
+            <wp:cNvGraphicFramePr>
+              <a:graphicFrameLocks noChangeAspect="1"/>
+            </wp:cNvGraphicFramePr>
+            <a:graphic>
+              <a:graphicData uri="http://schemas.openxmlformats.org/drawingml/2006/picture">
+                <pic:pic>
+                  <pic:nvPicPr>
+                    <pic:cNvPr id="0" name="prisma_flow.png"/>
+                    <pic:cNvPicPr/>
+                  </pic:nvPicPr>
+                  <pic:blipFill>
+                    <a:blip r:embed="rId15"/>
+                    <a:stretch>
+                      <a:fillRect/>
+                    </a:stretch>
+                  </pic:blipFill>
+                  <pic:spPr>
+                    <a:xfrm>
+                      <a:off x="0" y="0"/>
+                      <a:ext cx="4860000" cy="5434962"/>
+                    </a:xfrm>
+                    <a:prstGeom prst="rect"/>
+                  </pic:spPr>
+                </pic:pic>
+              </a:graphicData>
+            </a:graphic>
+          </wp:inline>
+        </w:drawing>
+      </w:r>
+    </w:p>
+    <w:p>
+      <w:pPr>
+        <w:spacing w:line="240" w:lineRule="auto" w:after="160" w:before="40"/>
+        <w:jc w:val="center"/>
+      </w:pPr>
+      <w:r>
+        <w:rPr>
+          <w:rFonts w:ascii="Book Antiqua" w:hAnsi="Book Antiqua"/>
+          <w:b w:val="0"/>
+          <w:i/>
+          <w:sz w:val="20"/>
+        </w:rPr>
+        <w:t>Figure 1. PRISMA 2020 flow diagram of the study selection process (counts illustrative; to be finalised upon complete extraction).</w:t>
       </w:r>
     </w:p>
     <w:p>

</xml_diff>